<commit_message>
docs: Te-Presentamos v1.1 — seccion 3.11 El gasto (Compras de Oficina, Centros de Costo, Ordenes de Pago); regenerado en Biblioteca y OneDrive
Co-Authored-By: Claude Fable 5 <noreply@anthropic.com>
</commit_message>
<xml_diff>
--- a/api-gateway/public/mantenedores/documentacion/descargas/Te-Presentamos-Business-Suite.docx
+++ b/api-gateway/public/mantenedores/documentacion/descargas/Te-Presentamos-Business-Suite.docx
@@ -128,7 +128,7 @@
           <w:color w:val="9AA0A6"/>
           <w:sz w:val="22"/>
         </w:rPr>
-        <w:t>Versión 1.0 · Agosto 2026</w:t>
+        <w:t>Versión 1.1 · Septiembre 2026</w:t>
       </w:r>
     </w:p>
     <w:p>
@@ -1266,7 +1266,57 @@
         <w:pStyle w:val="Heading2"/>
       </w:pPr>
       <w:r>
-        <w:t>3.11 Soporte y gobierno del sistema</w:t>
+        <w:t>3.11 El gasto: compras y centros de costo</w:t>
+      </w:r>
+    </w:p>
+    <w:p>
+      <w:pPr>
+        <w:pStyle w:val="ListBullet"/>
+      </w:pPr>
+      <w:r>
+        <w:rPr>
+          <w:b/>
+        </w:rPr>
+        <w:t xml:space="preserve">Compras de Oficina: </w:t>
+      </w:r>
+      <w:r>
+        <w:t>cada colaborador pide sus materiales de un catálogo con fotos y códigos del proveedor; el ciclo cierra el día 10, Administración concilia cantidades y precios, la orden de compra pasa por firmas y, al aprobarse, nacen solas la orden de pago y el correo a cada solicitante con lo aprobado.</w:t>
+      </w:r>
+    </w:p>
+    <w:p>
+      <w:pPr>
+        <w:pStyle w:val="ListBullet"/>
+      </w:pPr>
+      <w:r>
+        <w:rPr>
+          <w:b/>
+        </w:rPr>
+        <w:t xml:space="preserve">Centros de Costo: </w:t>
+      </w:r>
+      <w:r>
+        <w:t>cada compra y gasto queda imputado al área que lo genera (organigrama + parques con oficina), con el reporte mensual comparativo del gasto por centro.</w:t>
+      </w:r>
+    </w:p>
+    <w:p>
+      <w:pPr>
+        <w:pStyle w:val="ListBullet"/>
+      </w:pPr>
+      <w:r>
+        <w:rPr>
+          <w:b/>
+        </w:rPr>
+        <w:t xml:space="preserve">Órdenes de Pago: </w:t>
+      </w:r>
+      <w:r>
+        <w:t>proveedores con ficha y datos de transferencia, correlativo único de órdenes de pago, segregación de funciones (quien emite no paga) y contabilización automática.</w:t>
+      </w:r>
+    </w:p>
+    <w:p>
+      <w:pPr>
+        <w:pStyle w:val="Heading2"/>
+      </w:pPr>
+      <w:r>
+        <w:t>3.12 Soporte y gobierno del sistema</w:t>
       </w:r>
     </w:p>
     <w:p>

</xml_diff>